<commit_message>
Drop spaces around citations in Chinese text; 黑体 headings in reference docx
</commit_message>
<xml_diff>
--- a/_extensions/gbt7714/gbt7714-reference.docx
+++ b/_extensions/gbt7714/gbt7714-reference.docx
@@ -539,7 +539,7 @@
       <w:jc w:val="center"/>
     </w:pPr>
     <w:rPr>
-      <w:rFonts w:asciiTheme="majorHAnsi" w:eastAsiaTheme="majorEastAsia" w:hAnsiTheme="majorHAnsi" w:cstheme="majorBidi"/>
+      <w:rFonts w:ascii="Times New Roman" w:eastAsia="黑体" w:hAnsi="Times New Roman" w:cstheme="majorBidi"/>
       <w:sz w:val="56"/>
       <w:szCs w:val="56"/>
     </w:rPr>
@@ -551,7 +551,7 @@
     <w:uiPriority w:val="10"/>
     <w:rsid w:val="00A10FD9"/>
     <w:rPr>
-      <w:rFonts w:asciiTheme="majorHAnsi" w:eastAsiaTheme="majorEastAsia" w:hAnsiTheme="majorHAnsi" w:cstheme="majorBidi"/>
+      <w:rFonts w:ascii="Times New Roman" w:eastAsia="黑体" w:hAnsi="Times New Roman" w:cstheme="majorBidi"/>
       <w:sz w:val="56"/>
       <w:szCs w:val="56"/>
     </w:rPr>
@@ -570,7 +570,7 @@
       </w:numPr>
     </w:pPr>
     <w:rPr>
-      <w:rFonts w:eastAsiaTheme="majorEastAsia" w:cstheme="majorBidi"/>
+      <w:rFonts w:eastAsia="黑体" w:cstheme="majorBidi"/>
       <w:spacing w:val="15"/>
       <w:sz w:val="28"/>
       <w:szCs w:val="28"/>
@@ -583,7 +583,7 @@
     <w:uiPriority w:val="11"/>
     <w:rsid w:val="00A10FD9"/>
     <w:rPr>
-      <w:rFonts w:eastAsiaTheme="majorEastAsia" w:cstheme="majorBidi"/>
+      <w:rFonts w:eastAsia="黑体" w:cstheme="majorBidi"/>
       <w:color w:val="595959" w:themeColor="text1" w:themeTint="A6"/>
       <w:spacing w:val="15"/>
       <w:sz w:val="28"/>
@@ -676,7 +676,7 @@
       <w:outlineLvl w:val="0"/>
     </w:pPr>
     <w:rPr>
-      <w:rFonts w:asciiTheme="majorHAnsi" w:eastAsiaTheme="majorEastAsia" w:hAnsiTheme="majorHAnsi" w:cstheme="majorBidi"/>
+      <w:rFonts w:ascii="Times New Roman" w:eastAsia="黑体" w:hAnsi="Times New Roman" w:cstheme="majorBidi"/>
       <w:color w:val="0F4761" w:themeColor="accent1" w:themeShade="BF"/>
       <w:sz w:val="40"/>
       <w:szCs w:val="40"/>
@@ -699,7 +699,7 @@
       <w:outlineLvl w:val="1"/>
     </w:pPr>
     <w:rPr>
-      <w:rFonts w:asciiTheme="majorHAnsi" w:eastAsiaTheme="majorEastAsia" w:hAnsiTheme="majorHAnsi" w:cstheme="majorBidi"/>
+      <w:rFonts w:ascii="Times New Roman" w:eastAsia="黑体" w:hAnsi="Times New Roman" w:cstheme="majorBidi"/>
       <w:color w:val="0F4761" w:themeColor="accent1" w:themeShade="BF"/>
       <w:sz w:val="32"/>
       <w:szCs w:val="32"/>
@@ -722,7 +722,7 @@
       <w:outlineLvl w:val="2"/>
     </w:pPr>
     <w:rPr>
-      <w:rFonts w:eastAsiaTheme="majorEastAsia" w:cstheme="majorBidi"/>
+      <w:rFonts w:eastAsia="黑体" w:cstheme="majorBidi"/>
       <w:color w:val="0F4761" w:themeColor="accent1" w:themeShade="BF"/>
       <w:sz w:val="28"/>
       <w:szCs w:val="28"/>
@@ -745,7 +745,7 @@
       <w:outlineLvl w:val="3"/>
     </w:pPr>
     <w:rPr>
-      <w:rFonts w:eastAsiaTheme="majorEastAsia" w:cstheme="majorBidi"/>
+      <w:rFonts w:eastAsia="黑体" w:cstheme="majorBidi"/>
       <w:i/>
       <w:iCs/>
       <w:color w:val="0F4761" w:themeColor="accent1" w:themeShade="BF"/>
@@ -768,7 +768,7 @@
       <w:outlineLvl w:val="4"/>
     </w:pPr>
     <w:rPr>
-      <w:rFonts w:eastAsiaTheme="majorEastAsia" w:cstheme="majorBidi"/>
+      <w:rFonts w:eastAsia="黑体" w:cstheme="majorBidi"/>
       <w:color w:val="0F4761" w:themeColor="accent1" w:themeShade="BF"/>
     </w:rPr>
   </w:style>
@@ -789,7 +789,7 @@
       <w:outlineLvl w:val="5"/>
     </w:pPr>
     <w:rPr>
-      <w:rFonts w:eastAsiaTheme="majorEastAsia" w:cstheme="majorBidi"/>
+      <w:rFonts w:eastAsia="黑体" w:cstheme="majorBidi"/>
       <w:i/>
       <w:iCs/>
       <w:color w:val="595959" w:themeColor="text1" w:themeTint="A6"/>
@@ -812,7 +812,7 @@
       <w:outlineLvl w:val="6"/>
     </w:pPr>
     <w:rPr>
-      <w:rFonts w:eastAsiaTheme="majorEastAsia" w:cstheme="majorBidi"/>
+      <w:rFonts w:eastAsia="黑体" w:cstheme="majorBidi"/>
       <w:color w:val="595959" w:themeColor="text1" w:themeTint="A6"/>
     </w:rPr>
   </w:style>
@@ -833,7 +833,7 @@
       <w:outlineLvl w:val="7"/>
     </w:pPr>
     <w:rPr>
-      <w:rFonts w:eastAsiaTheme="majorEastAsia" w:cstheme="majorBidi"/>
+      <w:rFonts w:eastAsia="黑体" w:cstheme="majorBidi"/>
       <w:i/>
       <w:iCs/>
       <w:color w:val="272727" w:themeColor="text1" w:themeTint="D8"/>
@@ -856,7 +856,7 @@
       <w:outlineLvl w:val="8"/>
     </w:pPr>
     <w:rPr>
-      <w:rFonts w:eastAsiaTheme="majorEastAsia" w:cstheme="majorBidi"/>
+      <w:rFonts w:eastAsia="黑体" w:cstheme="majorBidi"/>
       <w:color w:val="272727" w:themeColor="text1" w:themeTint="D8"/>
     </w:rPr>
   </w:style>
@@ -867,7 +867,7 @@
     <w:uiPriority w:val="9"/>
     <w:rsid w:val="00A10FD9"/>
     <w:rPr>
-      <w:rFonts w:asciiTheme="majorHAnsi" w:eastAsiaTheme="majorEastAsia" w:hAnsiTheme="majorHAnsi" w:cstheme="majorBidi"/>
+      <w:rFonts w:ascii="Times New Roman" w:eastAsia="黑体" w:hAnsi="Times New Roman" w:cstheme="majorBidi"/>
       <w:color w:val="0F4761" w:themeColor="accent1" w:themeShade="BF"/>
       <w:sz w:val="40"/>
       <w:szCs w:val="40"/>
@@ -881,7 +881,7 @@
     <w:semiHidden/>
     <w:rsid w:val="00A10FD9"/>
     <w:rPr>
-      <w:rFonts w:asciiTheme="majorHAnsi" w:eastAsiaTheme="majorEastAsia" w:hAnsiTheme="majorHAnsi" w:cstheme="majorBidi"/>
+      <w:rFonts w:ascii="Times New Roman" w:eastAsia="黑体" w:hAnsi="Times New Roman" w:cstheme="majorBidi"/>
       <w:color w:val="0F4761" w:themeColor="accent1" w:themeShade="BF"/>
       <w:sz w:val="32"/>
       <w:szCs w:val="32"/>
@@ -895,7 +895,7 @@
     <w:semiHidden/>
     <w:rsid w:val="00A10FD9"/>
     <w:rPr>
-      <w:rFonts w:eastAsiaTheme="majorEastAsia" w:cstheme="majorBidi"/>
+      <w:rFonts w:eastAsia="黑体" w:cstheme="majorBidi"/>
       <w:color w:val="0F4761" w:themeColor="accent1" w:themeShade="BF"/>
       <w:sz w:val="28"/>
       <w:szCs w:val="28"/>
@@ -909,7 +909,7 @@
     <w:semiHidden/>
     <w:rsid w:val="00A10FD9"/>
     <w:rPr>
-      <w:rFonts w:eastAsiaTheme="majorEastAsia" w:cstheme="majorBidi"/>
+      <w:rFonts w:eastAsia="黑体" w:cstheme="majorBidi"/>
       <w:i/>
       <w:iCs/>
       <w:color w:val="0F4761" w:themeColor="accent1" w:themeShade="BF"/>
@@ -923,7 +923,7 @@
     <w:semiHidden/>
     <w:rsid w:val="00A10FD9"/>
     <w:rPr>
-      <w:rFonts w:eastAsiaTheme="majorEastAsia" w:cstheme="majorBidi"/>
+      <w:rFonts w:eastAsia="黑体" w:cstheme="majorBidi"/>
       <w:color w:val="0F4761" w:themeColor="accent1" w:themeShade="BF"/>
     </w:rPr>
   </w:style>
@@ -935,7 +935,7 @@
     <w:semiHidden/>
     <w:rsid w:val="00A10FD9"/>
     <w:rPr>
-      <w:rFonts w:eastAsiaTheme="majorEastAsia" w:cstheme="majorBidi"/>
+      <w:rFonts w:eastAsia="黑体" w:cstheme="majorBidi"/>
       <w:i/>
       <w:iCs/>
       <w:color w:val="595959" w:themeColor="text1" w:themeTint="A6"/>
@@ -949,7 +949,7 @@
     <w:semiHidden/>
     <w:rsid w:val="00A10FD9"/>
     <w:rPr>
-      <w:rFonts w:eastAsiaTheme="majorEastAsia" w:cstheme="majorBidi"/>
+      <w:rFonts w:eastAsia="黑体" w:cstheme="majorBidi"/>
       <w:color w:val="595959" w:themeColor="text1" w:themeTint="A6"/>
     </w:rPr>
   </w:style>
@@ -961,7 +961,7 @@
     <w:semiHidden/>
     <w:rsid w:val="00A10FD9"/>
     <w:rPr>
-      <w:rFonts w:eastAsiaTheme="majorEastAsia" w:cstheme="majorBidi"/>
+      <w:rFonts w:eastAsia="黑体" w:cstheme="majorBidi"/>
       <w:i/>
       <w:iCs/>
       <w:color w:val="272727" w:themeColor="text1" w:themeTint="D8"/>
@@ -975,7 +975,7 @@
     <w:semiHidden/>
     <w:rsid w:val="00A10FD9"/>
     <w:rPr>
-      <w:rFonts w:eastAsiaTheme="majorEastAsia" w:cstheme="majorBidi"/>
+      <w:rFonts w:eastAsia="黑体" w:cstheme="majorBidi"/>
       <w:color w:val="272727" w:themeColor="text1" w:themeTint="D8"/>
     </w:rPr>
   </w:style>
@@ -1133,7 +1133,7 @@
       <w:outlineLvl w:val="9"/>
     </w:pPr>
     <w:rPr>
-      <w:rFonts w:asciiTheme="majorHAnsi" w:eastAsiaTheme="majorEastAsia" w:hAnsiTheme="majorHAnsi" w:cstheme="majorBidi"/>
+      <w:rFonts w:ascii="Times New Roman" w:eastAsia="黑体" w:hAnsi="Times New Roman" w:cstheme="majorBidi"/>
       <w:b w:val="0"/>
       <w:bCs w:val="0"/>
       <w:color w:val="365F91" w:themeColor="accent1" w:themeShade="BF"/>

</xml_diff>